<commit_message>
Deployed 939cb501 with MkDocs version: 1.6.1
</commit_message>
<xml_diff>
--- a/download/controllable_unit_service_provider.docx
+++ b/download/controllable_unit_service_provider.docx
@@ -674,41 +674,6 @@
             </w:pPr>
             <w:r>
               <w:t xml:space="preserve">Status</w:t>
-            </w:r>
-          </w:p>
-        </w:tc>
-      </w:tr>
-      <w:tr>
-        <w:tc>
-          <w:tcPr/>
-          <w:p>
-            <w:pPr>
-              <w:pStyle w:val="Compact"/>
-            </w:pPr>
-            <w:r>
-              <w:t xml:space="preserve">CUSP-VAL001</w:t>
-            </w:r>
-          </w:p>
-        </w:tc>
-        <w:tc>
-          <w:tcPr/>
-          <w:p>
-            <w:pPr>
-              <w:pStyle w:val="Compact"/>
-            </w:pPr>
-            <w:r>
-              <w:t xml:space="preserve">Valid time is frozen after 2 weeks for SP.</w:t>
-            </w:r>
-          </w:p>
-        </w:tc>
-        <w:tc>
-          <w:tcPr/>
-          <w:p>
-            <w:pPr>
-              <w:pStyle w:val="Compact"/>
-            </w:pPr>
-            <w:r>
-              <w:t xml:space="preserve">DONE</w:t>
             </w:r>
           </w:p>
         </w:tc>
@@ -1711,7 +1676,7 @@
               <w:pStyle w:val="Compact"/>
             </w:pPr>
             <w:r>
-              <w:t xml:space="preserve">Create, read, update and delete CUSP where they are SP.</w:t>
+              <w:t xml:space="preserve">Create, read and update CUSP where they are SP.</w:t>
             </w:r>
           </w:p>
         </w:tc>

</xml_diff>